<commit_message>
Commit 2. Investigación de mas herramientas
se termino por hacer un cambio de planes debido a que el planteamiento anterior no tuvo exito.
</commit_message>
<xml_diff>
--- a/Septima semana de Técnicas de Inteligencia Artificial.docx
+++ b/Septima semana de Técnicas de Inteligencia Artificial.docx
@@ -66,8 +66,17 @@
       </w:pPr>
       <w:r>
         <w:rPr>
-          <w:rtl w:val="0"/>
-        </w:rPr>
+          <w:b w:val="1"/>
+          <w:bCs w:val="1"/>
+          <w:rtl w:val="0"/>
+        </w:rPr>
+        <w:t xml:space="preserve">Actividad 2:</w:t>
+      </w:r>
+      <w:r>
+        <w:rPr>
+          <w:rtl w:val="0"/>
+        </w:rPr>
+        <w:t xml:space="preserve"> El día Jueves 8 de octubre se cambió el plan de utilizar Waydroid y la app oficial del dron porque no había manera de que la app pudiera comunicarse con el dron, así que se investigó una alternativa.</w:t>
       </w:r>
     </w:p>
     <w:sectPr>

</xml_diff>

<commit_message>
Commit 3. Alternativa a la app oficial
Se encontró una alternativa a la app oficial del dron, y esa app es la que se utilizara de ahora en adelante (o eso creo...)
</commit_message>
<xml_diff>
--- a/Septima semana de Técnicas de Inteligencia Artificial.docx
+++ b/Septima semana de Técnicas de Inteligencia Artificial.docx
@@ -77,6 +77,35 @@
           <w:rtl w:val="0"/>
         </w:rPr>
         <w:t xml:space="preserve"> El día Jueves 8 de octubre se cambió el plan de utilizar Waydroid y la app oficial del dron porque no había manera de que la app pudiera comunicarse con el dron, así que se investigó una alternativa.</w:t>
+      </w:r>
+    </w:p>
+    <w:p>
+      <w:pPr>
+        <w:rPr/>
+      </w:pPr>
+      <w:r>
+        <w:rPr>
+          <w:rtl w:val="0"/>
+        </w:rPr>
+      </w:r>
+    </w:p>
+    <w:p>
+      <w:pPr>
+        <w:rPr/>
+      </w:pPr>
+      <w:r>
+        <w:rPr>
+          <w:b w:val="1"/>
+          <w:bCs w:val="1"/>
+          <w:rtl w:val="0"/>
+        </w:rPr>
+        <w:t xml:space="preserve">Actividad 3:</w:t>
+      </w:r>
+      <w:r>
+        <w:rPr>
+          <w:rtl w:val="0"/>
+        </w:rPr>
+        <w:t xml:space="preserve"> El dia Jueves 8 de octubre se dio como concluida la investigación anterior, y se optó por utilizar “Turbodrone” una alternativa a la app oficial del dron que permite controlarlo mediante una página web siendo este un proyecto impulsado por la comunidad y el cual si se tuvo el resultado esperado, aqui dejo el link del github: https://github.com/marshallrichards/turbodrone</w:t>
       </w:r>
     </w:p>
     <w:sectPr>

</xml_diff>